<commit_message>
Add Streamlit UI (P0) and document the Net3 convergence finding
- app.py: web UI over the case runner -- network/mode selection with per-network
  recommendations and honest warnings, run with progress, metric cards, tabbed
  plots (schedule/flows/heads/convergence/error) plus solver log, and a session
  comparison table across cases. Launch config in .claude/launch.json.
- Methodology doc: add the controlled experiment showing Net3's replay gap is
  structural (tightening tol 0.5->0.05 and iterations 20->150 leaves every
  replay metric identical): discrete tank events, sub-hourly transition
  sampling, and EPANET's slightly negative pressures -- not linearization
  convergence. Tank-closure modeling planned with the PRV phase.

Co-Authored-By: Claude Opus 4.8 <noreply@anthropic.com>
</commit_message>
<xml_diff>
--- a/Python/docs/OWF_Methodology.docx
+++ b/Python/docs/OWF_Methodology.docx
@@ -4269,6 +4269,29 @@
         </w:tc>
       </w:tr>
     </w:tbl>
+    <w:p>
+      <w:pPr>
+        <w:spacing w:after="120"/>
+      </w:pPr>
+      <w:r>
+        <w:t xml:space="preserve"/>
+      </w:r>
+    </w:p>
+    <w:p>
+      <w:pPr>
+        <w:spacing w:after="120"/>
+      </w:pPr>
+      <w:r>
+        <w:rPr>
+          <w:b/>
+          <w:bCs/>
+        </w:rPr>
+        <w:t xml:space="preserve">Convergence is not the limiter on Net3. </w:t>
+      </w:r>
+      <w:r>
+        <w:t xml:space="preserve">A controlled experiment tightened the fixed-schedule LP from (tol 0.5, 20 iterations) to (tol 0.05, 150 iterations): the iterate-change norm fell only from 1.89 to 1.21 — a per-variable movement of fractions of a GPM — while every EPANET-replay metric remained identical to 0.01 GPM (max |Δhead| 4.545 ft; loop-pipe gaps 547/512/512 GPM). The linearized model has reached its fixed point; the residual ≈5% mid-day re-split among parallel loop pipes (hours 6–14, all pumps off) is structural: EPANET's discrete tank-level events re-split the gravity supply abruptly (the smooth tank integrator has no such switch), pump-transition hours are sampled at hour boundaries while EPANET sub-steps within the hour, and EPANET itself operates with slightly negative pressures there (the constant 1.9 ft slack in every iterate). Pumps, trunk flows, tank trajectories and cost are unaffected. Modeling EPANET-style tank closure (one additional binary per tank-hour) is the remaining lever and is planned together with the PRV phase.</w:t>
+      </w:r>
+    </w:p>
     <w:p>
       <w:pPr>
         <w:pStyle w:val="Heading1"/>

</xml_diff>